<commit_message>
docs/macos-manual: deterministic reference.docx — explicit fonts, SourceCode style
The pandoc-default reference docx styles body text with NO explicit
fonts and headings via THEME references (asciiTheme=majorHAnsi);
Word/LibreOffice versions resolve themes differently, so output
styling varied by machine (Dave saw styles apply to only the first
paragraph of each section). It also lacked a Source Code paragraph
style, leaving code blocks to renderer improvisation.

tools/make_reference_docx.py now builds reference.docx from the pandoc
default with explicit fonts on every used style (Arial headings, Times
New Roman body, Courier New code — all substitute cleanly to Liberation
fonts on Linux) and injects a proper SourceCode style (9pt mono, light
shading, indent). Makefile: reference.docx added to the docx targets'
dependencies so styling changes trigger rebuilds.

Co-Authored-By: Claude Fable 5 <noreply@anthropic.com>
</commit_message>
<xml_diff>
--- a/docs/macos-manual/reference.docx
+++ b/docs/macos-manual/reference.docx
@@ -561,6 +561,10 @@
   <w:style w:type="paragraph" w:default="1" w:styleId="Normal">
     <w:name w:val="Normal"/>
     <w:qFormat/>
+    <w:rPr>
+      <w:rFonts w:ascii="Times New Roman" w:hAnsi="Times New Roman" w:eastAsia="Times New Roman" w:cs="Times New Roman"/>
+      <w:sz w:val="22"/>
+    </w:rPr>
   </w:style>
   <w:style w:type="paragraph" w:styleId="BodyText">
     <w:name w:val="Body Text"/>
@@ -570,12 +574,18 @@
       <w:spacing w:before="180" w:after="180"/>
     </w:pPr>
     <w:qFormat/>
+    <w:rPr>
+      <w:rFonts w:ascii="Times New Roman" w:hAnsi="Times New Roman" w:eastAsia="Times New Roman" w:cs="Times New Roman"/>
+    </w:rPr>
   </w:style>
   <w:style w:type="paragraph" w:customStyle="1" w:styleId="FirstParagraph">
     <w:name w:val="First Paragraph"/>
     <w:basedOn w:val="BodyText"/>
     <w:next w:val="BodyText"/>
     <w:qFormat/>
+    <w:rPr>
+      <w:rFonts w:ascii="Times New Roman" w:hAnsi="Times New Roman" w:eastAsia="Times New Roman" w:cs="Times New Roman"/>
+    </w:rPr>
   </w:style>
   <w:style w:type="paragraph" w:customStyle="1" w:styleId="Compact">
     <w:name w:val="Compact"/>
@@ -584,6 +594,9 @@
     <w:pPr>
       <w:spacing w:before="36" w:after="36"/>
     </w:pPr>
+    <w:rPr>
+      <w:rFonts w:ascii="Times New Roman" w:hAnsi="Times New Roman" w:eastAsia="Times New Roman" w:cs="Times New Roman"/>
+    </w:rPr>
   </w:style>
   <w:style w:type="paragraph" w:styleId="Title">
     <w:name w:val="Title"/>
@@ -597,11 +610,11 @@
       <w:jc w:val="center"/>
     </w:pPr>
     <w:rPr>
-      <w:rFonts w:asciiTheme="majorHAnsi" w:eastAsiaTheme="majorEastAsia" w:hAnsiTheme="majorHAnsi" w:cstheme="majorBidi"/>
+      <w:rFonts w:ascii="Arial" w:hAnsi="Arial" w:eastAsia="Arial" w:cs="Arial"/>
       <w:b/>
       <w:bCs/>
       <w:color w:val="345A8A" w:themeColor="accent1" w:themeShade="B5"/>
-      <w:sz w:val="36"/>
+      <w:sz w:val="56"/>
       <w:szCs w:val="36"/>
     </w:rPr>
   </w:style>
@@ -617,6 +630,7 @@
       <w:jc w:val="center"/>
     </w:pPr>
     <w:rPr>
+      <w:rFonts w:ascii="Arial" w:hAnsi="Arial" w:eastAsia="Arial" w:cs="Arial"/>
       <w:sz w:val="30"/>
       <w:szCs w:val="30"/>
     </w:rPr>
@@ -696,7 +710,7 @@
       <w:outlineLvl w:val="0"/>
     </w:pPr>
     <w:rPr>
-      <w:rFonts w:asciiTheme="majorHAnsi" w:eastAsiaTheme="majorEastAsia" w:hAnsiTheme="majorHAnsi" w:cstheme="majorBidi"/>
+      <w:rFonts w:ascii="Arial" w:hAnsi="Arial" w:eastAsia="Arial" w:cs="Arial"/>
       <w:b/>
       <w:bCs/>
       <w:color w:val="4F81BD" w:themeColor="accent1"/>
@@ -718,7 +732,7 @@
       <w:outlineLvl w:val="1"/>
     </w:pPr>
     <w:rPr>
-      <w:rFonts w:asciiTheme="majorHAnsi" w:eastAsiaTheme="majorEastAsia" w:hAnsiTheme="majorHAnsi" w:cstheme="majorBidi"/>
+      <w:rFonts w:ascii="Arial" w:hAnsi="Arial" w:eastAsia="Arial" w:cs="Arial"/>
       <w:b/>
       <w:bCs/>
       <w:color w:val="4F81BD" w:themeColor="accent1"/>
@@ -740,7 +754,7 @@
       <w:outlineLvl w:val="2"/>
     </w:pPr>
     <w:rPr>
-      <w:rFonts w:asciiTheme="majorHAnsi" w:eastAsiaTheme="majorEastAsia" w:hAnsiTheme="majorHAnsi" w:cstheme="majorBidi"/>
+      <w:rFonts w:ascii="Arial" w:hAnsi="Arial" w:eastAsia="Arial" w:cs="Arial"/>
       <w:b/>
       <w:bCs/>
       <w:color w:val="4F81BD" w:themeColor="accent1"/>
@@ -762,11 +776,11 @@
       <w:outlineLvl w:val="3"/>
     </w:pPr>
     <w:rPr>
-      <w:rFonts w:asciiTheme="majorHAnsi" w:eastAsiaTheme="majorEastAsia" w:hAnsiTheme="majorHAnsi" w:cstheme="majorBidi"/>
+      <w:rFonts w:ascii="Arial" w:hAnsi="Arial" w:eastAsia="Arial" w:cs="Arial"/>
       <w:i/>
       <w:bCs/>
       <w:color w:val="4F81BD" w:themeColor="accent1"/>
-      <w:sz w:val="24"/>
+      <w:sz w:val="22"/>
       <w:szCs w:val="24"/>
     </w:rPr>
   </w:style>
@@ -784,7 +798,7 @@
       <w:outlineLvl w:val="4"/>
     </w:pPr>
     <w:rPr>
-      <w:rFonts w:asciiTheme="majorHAnsi" w:eastAsiaTheme="majorEastAsia" w:hAnsiTheme="majorHAnsi" w:cstheme="majorBidi"/>
+      <w:rFonts w:ascii="Arial" w:hAnsi="Arial" w:eastAsia="Arial" w:cs="Arial"/>
       <w:iCs/>
       <w:color w:val="4F81BD" w:themeColor="accent1"/>
       <w:sz w:val="24"/>
@@ -882,6 +896,9 @@
       <w:spacing w:before="100" w:after="100"/>
       <w:ind w:firstLine="0" w:left="480" w:right="480"/>
     </w:pPr>
+    <w:rPr>
+      <w:rFonts w:ascii="Times New Roman" w:hAnsi="Times New Roman" w:eastAsia="Times New Roman" w:cs="Times New Roman"/>
+    </w:rPr>
   </w:style>
   <w:style w:type="paragraph" w:styleId="FootnoteText">
     <w:name w:val="Footnote Text"/>
@@ -986,7 +1003,7 @@
     <w:name w:val="Verbatim Char"/>
     <w:basedOn w:val="BodyTextChar"/>
     <w:rPr>
-      <w:rFonts w:ascii="Consolas" w:hAnsi="Consolas"/>
+      <w:rFonts w:ascii="Courier New" w:hAnsi="Courier New" w:eastAsia="Courier New" w:cs="Courier New"/>
       <w:sz w:val="22"/>
     </w:rPr>
   </w:style>
@@ -1020,10 +1037,25 @@
       <w:outlineLvl w:val="9"/>
     </w:pPr>
     <w:rPr>
-      <w:rFonts w:asciiTheme="majorHAnsi" w:eastAsiaTheme="majorEastAsia" w:hAnsiTheme="majorHAnsi" w:cstheme="majorBidi"/>
+      <w:rFonts w:ascii="Arial" w:hAnsi="Arial" w:eastAsia="Arial" w:cs="Arial"/>
       <w:b w:val="0"/>
       <w:bCs w:val="0"/>
       <w:color w:val="365F91" w:themeColor="accent1" w:themeShade="BF"/>
+    </w:rPr>
+  </w:style>
+  <w:style w:type="paragraph" w:styleId="SourceCode">
+    <w:name w:val="Source Code"/>
+    <w:basedOn w:val="Normal"/>
+    <w:pPr>
+      <w:wordWrap w:val="0"/>
+      <w:spacing w:before="60" w:after="60" w:line="240" w:lineRule="auto"/>
+      <w:ind w:left="480"/>
+      <w:shd w:val="clear" w:color="auto" w:fill="F5F5F5"/>
+    </w:pPr>
+    <w:rPr>
+      <w:rFonts w:ascii="Courier New" w:hAnsi="Courier New" w:cs="Courier New"/>
+      <w:sz w:val="18"/>
+      <w:szCs w:val="18"/>
     </w:rPr>
   </w:style>
 </w:styles>

</xml_diff>